<commit_message>
chore(docs): reorg + update COSTS to 5/20
整理：
- 删 8 个 .DS_Store + .Rhistory + DEMO_SCRIPT.md（已 docx 化）
- 旧 4/15 pptx 入档：根目录 → docs/presentation/archive/2026-04-15-初版演示.pptx
- COSTS.xlsx 单独成区：docs/presentation/week-2/ → docs/finances/
  （成本账本不该 time-bound，应该常驻）
- 加 docs/finances/README.md 索引 + 更新规则
- .gitignore +.Rhistory / miniprogram/.swc/ / Office 锁文件

账本更新（4/29 → 5/20 3 周增量）：
- 开发者（5 月）       +$1,300（PNR / 护照打包 / 待办 / 字段扩展 / 拼房等）
- AI 编码工具（5 月）  +$100
- 服务器（5 月 HK）    +$32
- AI API + 测试        +$30
- OpenRouter 实验      +$50
合计已花：$5,693 → ~$7,205（57 个公式全绿）

重生成所有 5 个 docx（INDEX 中 COSTS 路径已更新到 ../../finances/）。

Co-Authored-By: Claude Opus 4.7 (1M context) <noreply@anthropic.com>
</commit_message>
<xml_diff>
--- a/docs/presentation/week-2/INDEX.docx
+++ b/docs/presentation/week-2/INDEX.docx
@@ -537,7 +537,7 @@
                 <w:sz w:val="22"/>
                 <w:szCs w:val="22"/>
               </w:rPr>
-              <w:t xml:space="preserve">COSTS.xlsx</w:t>
+              <w:t xml:space="preserve">../../finances/COSTS.xlsx</w:t>
             </w:r>
           </w:p>
         </w:tc>
@@ -597,7 +597,7 @@
                 <w:sz w:val="22"/>
                 <w:szCs w:val="22"/>
               </w:rPr>
-              <w:t xml:space="preserve">已花 ~$5,000 + 投产后 3 阶段月成本（4 个 Tab）</w:t>
+              <w:t xml:space="preserve">已花 ~$7,200 + 投产后 3 阶段月成本（4 个 Tab）</w:t>
             </w:r>
           </w:p>
         </w:tc>
@@ -1526,7 +1526,7 @@
           <w:sz w:val="20"/>
           <w:szCs w:val="20"/>
         </w:rPr>
-        <w:t xml:space="preserve">- COSTS.xlsx         — 成本估算</w:t>
+        <w:t xml:space="preserve">- ../../finances/COSTS.xlsx — 成本估算（已搬到 docs/finances/）</w:t>
       </w:r>
     </w:p>
     <w:p>

</xml_diff>